<commit_message>
updating whole UML diagram and change diagram in documentation
</commit_message>
<xml_diff>
--- a/documentation.docx
+++ b/documentation.docx
@@ -2411,14 +2411,30 @@
                 <w:sz w:val="32"/>
                 <w:szCs w:val="32"/>
               </w:rPr>
-              <w:t xml:space="preserve"> Diagram</w:t>
-            </w:r>
-            <w:r>
-              <w:rPr>
-                <w:sz w:val="32"/>
-                <w:szCs w:val="32"/>
-              </w:rPr>
-              <w:t>,, Sequence Diagram, Activity Diagram.</w:t>
+              <w:t xml:space="preserve"> </w:t>
+            </w:r>
+            <w:proofErr w:type="gramStart"/>
+            <w:r>
+              <w:rPr>
+                <w:sz w:val="32"/>
+                <w:szCs w:val="32"/>
+              </w:rPr>
+              <w:t>Diagram</w:t>
+            </w:r>
+            <w:r>
+              <w:rPr>
+                <w:sz w:val="32"/>
+                <w:szCs w:val="32"/>
+              </w:rPr>
+              <w:t>,,</w:t>
+            </w:r>
+            <w:proofErr w:type="gramEnd"/>
+            <w:r>
+              <w:rPr>
+                <w:sz w:val="32"/>
+                <w:szCs w:val="32"/>
+              </w:rPr>
+              <w:t xml:space="preserve"> Sequence Diagram, Activity Diagram.</w:t>
             </w:r>
           </w:p>
         </w:tc>
@@ -6566,23 +6582,7 @@
           <w:sz w:val="32"/>
           <w:szCs w:val="32"/>
         </w:rPr>
-        <w:t>Password encryption (</w:t>
-      </w:r>
-      <w:proofErr w:type="spellStart"/>
-      <w:r>
-        <w:rPr>
-          <w:sz w:val="32"/>
-          <w:szCs w:val="32"/>
-        </w:rPr>
-        <w:t>BCrypt</w:t>
-      </w:r>
-      <w:proofErr w:type="spellEnd"/>
-      <w:r>
-        <w:rPr>
-          <w:sz w:val="32"/>
-          <w:szCs w:val="32"/>
-        </w:rPr>
-        <w:t>)</w:t>
+        <w:t>Password encryption (BCrypt)</w:t>
       </w:r>
     </w:p>
     <w:p>
@@ -9563,15 +9563,14 @@
         <w:rPr>
           <w:b/>
           <w:bCs/>
-          <w:noProof/>
           <w:sz w:val="32"/>
           <w:szCs w:val="32"/>
         </w:rPr>
         <w:drawing>
-          <wp:inline distT="0" distB="0" distL="0" distR="0" wp14:anchorId="7761F2C4" wp14:editId="64F03555">
-            <wp:extent cx="5731510" cy="5153660"/>
-            <wp:effectExtent l="0" t="0" r="2540" b="8890"/>
-            <wp:docPr id="1446036354" name="Picture 1"/>
+          <wp:inline distT="0" distB="0" distL="0" distR="0" wp14:anchorId="62B7BFE8" wp14:editId="45E28620">
+            <wp:extent cx="5731510" cy="5424805"/>
+            <wp:effectExtent l="0" t="0" r="2540" b="4445"/>
+            <wp:docPr id="1999771328" name="Picture 1"/>
             <wp:cNvGraphicFramePr>
               <a:graphicFrameLocks xmlns:a="http://schemas.openxmlformats.org/drawingml/2006/main" noChangeAspect="1"/>
             </wp:cNvGraphicFramePr>
@@ -9579,7 +9578,7 @@
               <a:graphicData uri="http://schemas.openxmlformats.org/drawingml/2006/picture">
                 <pic:pic xmlns:pic="http://schemas.openxmlformats.org/drawingml/2006/picture">
                   <pic:nvPicPr>
-                    <pic:cNvPr id="1446036354" name=""/>
+                    <pic:cNvPr id="1999771328" name=""/>
                     <pic:cNvPicPr/>
                   </pic:nvPicPr>
                   <pic:blipFill>
@@ -9591,7 +9590,7 @@
                   <pic:spPr>
                     <a:xfrm>
                       <a:off x="0" y="0"/>
-                      <a:ext cx="5731510" cy="5153660"/>
+                      <a:ext cx="5731510" cy="5424805"/>
                     </a:xfrm>
                     <a:prstGeom prst="rect">
                       <a:avLst/>
@@ -9746,17 +9745,6 @@
           <w:szCs w:val="32"/>
         </w:rPr>
       </w:pPr>
-    </w:p>
-    <w:p>
-      <w:pPr>
-        <w:jc w:val="center"/>
-        <w:rPr>
-          <w:b/>
-          <w:bCs/>
-          <w:sz w:val="32"/>
-          <w:szCs w:val="32"/>
-        </w:rPr>
-      </w:pPr>
       <w:r>
         <w:rPr>
           <w:b/>
@@ -9792,15 +9780,14 @@
         <w:rPr>
           <w:b/>
           <w:bCs/>
-          <w:noProof/>
           <w:sz w:val="32"/>
           <w:szCs w:val="32"/>
         </w:rPr>
         <w:drawing>
-          <wp:inline distT="0" distB="0" distL="0" distR="0" wp14:anchorId="7E0C048E" wp14:editId="1F0DB733">
-            <wp:extent cx="6225540" cy="8046720"/>
-            <wp:effectExtent l="0" t="0" r="3810" b="0"/>
-            <wp:docPr id="562418520" name="Picture 1"/>
+          <wp:inline distT="0" distB="0" distL="0" distR="0" wp14:anchorId="1CD170BC" wp14:editId="414BC7B7">
+            <wp:extent cx="6515100" cy="7917180"/>
+            <wp:effectExtent l="0" t="0" r="0" b="7620"/>
+            <wp:docPr id="740397229" name="Picture 1"/>
             <wp:cNvGraphicFramePr>
               <a:graphicFrameLocks xmlns:a="http://schemas.openxmlformats.org/drawingml/2006/main" noChangeAspect="1"/>
             </wp:cNvGraphicFramePr>
@@ -9808,12 +9795,11 @@
               <a:graphicData uri="http://schemas.openxmlformats.org/drawingml/2006/picture">
                 <pic:pic xmlns:pic="http://schemas.openxmlformats.org/drawingml/2006/picture">
                   <pic:nvPicPr>
-                    <pic:cNvPr id="562418520" name=""/>
+                    <pic:cNvPr id="740397229" name=""/>
                     <pic:cNvPicPr/>
                   </pic:nvPicPr>
-                  <pic:blipFill rotWithShape="1">
+                  <pic:blipFill>
                     <a:blip r:embed="rId8"/>
-                    <a:srcRect t="-186" b="1"/>
                     <a:stretch>
                       <a:fillRect/>
                     </a:stretch>
@@ -9821,7 +9807,7 @@
                   <pic:spPr>
                     <a:xfrm>
                       <a:off x="0" y="0"/>
-                      <a:ext cx="6225540" cy="8046720"/>
+                      <a:ext cx="6515100" cy="7917180"/>
                     </a:xfrm>
                     <a:prstGeom prst="rect">
                       <a:avLst/>
@@ -9969,10 +9955,10 @@
           <w:szCs w:val="32"/>
         </w:rPr>
         <w:drawing>
-          <wp:inline distT="0" distB="0" distL="0" distR="0" wp14:anchorId="5A231AA9" wp14:editId="1D61B07F">
-            <wp:extent cx="5731510" cy="4145915"/>
-            <wp:effectExtent l="0" t="0" r="2540" b="6985"/>
-            <wp:docPr id="1471478359" name="Picture 1"/>
+          <wp:inline distT="0" distB="0" distL="0" distR="0" wp14:anchorId="4BDDD3C6" wp14:editId="3971A3E6">
+            <wp:extent cx="5731510" cy="4084955"/>
+            <wp:effectExtent l="0" t="0" r="2540" b="0"/>
+            <wp:docPr id="1567090599" name="Picture 1"/>
             <wp:cNvGraphicFramePr>
               <a:graphicFrameLocks xmlns:a="http://schemas.openxmlformats.org/drawingml/2006/main" noChangeAspect="1"/>
             </wp:cNvGraphicFramePr>
@@ -9980,7 +9966,7 @@
               <a:graphicData uri="http://schemas.openxmlformats.org/drawingml/2006/picture">
                 <pic:pic xmlns:pic="http://schemas.openxmlformats.org/drawingml/2006/picture">
                   <pic:nvPicPr>
-                    <pic:cNvPr id="1471478359" name=""/>
+                    <pic:cNvPr id="1567090599" name=""/>
                     <pic:cNvPicPr/>
                   </pic:nvPicPr>
                   <pic:blipFill>
@@ -9992,7 +9978,7 @@
                   <pic:spPr>
                     <a:xfrm>
                       <a:off x="0" y="0"/>
-                      <a:ext cx="5731510" cy="4145915"/>
+                      <a:ext cx="5731510" cy="4084955"/>
                     </a:xfrm>
                     <a:prstGeom prst="rect">
                       <a:avLst/>
@@ -10179,6 +10165,16 @@
           <w:szCs w:val="32"/>
         </w:rPr>
       </w:pPr>
+    </w:p>
+    <w:p>
+      <w:pPr>
+        <w:rPr>
+          <w:b/>
+          <w:bCs/>
+          <w:sz w:val="32"/>
+          <w:szCs w:val="32"/>
+        </w:rPr>
+      </w:pPr>
       <w:r>
         <w:rPr>
           <w:b/>
@@ -10187,16 +10183,7 @@
           <w:szCs w:val="32"/>
         </w:rPr>
         <w:lastRenderedPageBreak/>
-        <w:t>Use Case Diagram</w:t>
-      </w:r>
-      <w:r>
-        <w:rPr>
-          <w:b/>
-          <w:bCs/>
-          <w:sz w:val="32"/>
-          <w:szCs w:val="32"/>
-        </w:rPr>
-        <w:t xml:space="preserve"> User</w:t>
+        <w:t>Use Case Diagram User</w:t>
       </w:r>
     </w:p>
     <w:p>
@@ -10224,15 +10211,14 @@
         <w:rPr>
           <w:b/>
           <w:bCs/>
-          <w:noProof/>
           <w:sz w:val="32"/>
           <w:szCs w:val="32"/>
         </w:rPr>
         <w:drawing>
-          <wp:inline distT="0" distB="0" distL="0" distR="0" wp14:anchorId="245C2F06" wp14:editId="6759FCB5">
-            <wp:extent cx="5731510" cy="5675630"/>
-            <wp:effectExtent l="0" t="0" r="2540" b="1270"/>
-            <wp:docPr id="156871752" name="Picture 1"/>
+          <wp:inline distT="0" distB="0" distL="0" distR="0" wp14:anchorId="7F64CC01" wp14:editId="62960BF1">
+            <wp:extent cx="5731510" cy="7193280"/>
+            <wp:effectExtent l="0" t="0" r="2540" b="7620"/>
+            <wp:docPr id="1920451515" name="Picture 1"/>
             <wp:cNvGraphicFramePr>
               <a:graphicFrameLocks xmlns:a="http://schemas.openxmlformats.org/drawingml/2006/main" noChangeAspect="1"/>
             </wp:cNvGraphicFramePr>
@@ -10240,7 +10226,7 @@
               <a:graphicData uri="http://schemas.openxmlformats.org/drawingml/2006/picture">
                 <pic:pic xmlns:pic="http://schemas.openxmlformats.org/drawingml/2006/picture">
                   <pic:nvPicPr>
-                    <pic:cNvPr id="156871752" name=""/>
+                    <pic:cNvPr id="1920451515" name=""/>
                     <pic:cNvPicPr/>
                   </pic:nvPicPr>
                   <pic:blipFill>
@@ -10252,7 +10238,7 @@
                   <pic:spPr>
                     <a:xfrm>
                       <a:off x="0" y="0"/>
-                      <a:ext cx="5731510" cy="5675630"/>
+                      <a:ext cx="5731510" cy="7193280"/>
                     </a:xfrm>
                     <a:prstGeom prst="rect">
                       <a:avLst/>
@@ -10319,83 +10305,6 @@
           <w:szCs w:val="32"/>
         </w:rPr>
       </w:pPr>
-    </w:p>
-    <w:p>
-      <w:pPr>
-        <w:jc w:val="center"/>
-        <w:rPr>
-          <w:b/>
-          <w:bCs/>
-          <w:sz w:val="32"/>
-          <w:szCs w:val="32"/>
-        </w:rPr>
-      </w:pPr>
-    </w:p>
-    <w:p>
-      <w:pPr>
-        <w:jc w:val="center"/>
-        <w:rPr>
-          <w:b/>
-          <w:bCs/>
-          <w:sz w:val="32"/>
-          <w:szCs w:val="32"/>
-        </w:rPr>
-      </w:pPr>
-    </w:p>
-    <w:p>
-      <w:pPr>
-        <w:jc w:val="center"/>
-        <w:rPr>
-          <w:b/>
-          <w:bCs/>
-          <w:sz w:val="32"/>
-          <w:szCs w:val="32"/>
-        </w:rPr>
-      </w:pPr>
-    </w:p>
-    <w:p>
-      <w:pPr>
-        <w:jc w:val="center"/>
-        <w:rPr>
-          <w:b/>
-          <w:bCs/>
-          <w:sz w:val="32"/>
-          <w:szCs w:val="32"/>
-        </w:rPr>
-      </w:pPr>
-    </w:p>
-    <w:p>
-      <w:pPr>
-        <w:jc w:val="center"/>
-        <w:rPr>
-          <w:b/>
-          <w:bCs/>
-          <w:sz w:val="32"/>
-          <w:szCs w:val="32"/>
-        </w:rPr>
-      </w:pPr>
-    </w:p>
-    <w:p>
-      <w:pPr>
-        <w:jc w:val="center"/>
-        <w:rPr>
-          <w:b/>
-          <w:bCs/>
-          <w:sz w:val="32"/>
-          <w:szCs w:val="32"/>
-        </w:rPr>
-      </w:pPr>
-    </w:p>
-    <w:p>
-      <w:pPr>
-        <w:jc w:val="center"/>
-        <w:rPr>
-          <w:b/>
-          <w:bCs/>
-          <w:sz w:val="32"/>
-          <w:szCs w:val="32"/>
-        </w:rPr>
-      </w:pPr>
       <w:r>
         <w:rPr>
           <w:b/>
@@ -10474,10 +10383,10 @@
           <w:szCs w:val="32"/>
         </w:rPr>
         <w:drawing>
-          <wp:inline distT="0" distB="0" distL="0" distR="0" wp14:anchorId="715AFAF1" wp14:editId="20788B06">
-            <wp:extent cx="5731510" cy="4742815"/>
-            <wp:effectExtent l="0" t="0" r="2540" b="635"/>
-            <wp:docPr id="1195232573" name="Picture 1"/>
+          <wp:inline distT="0" distB="0" distL="0" distR="0" wp14:anchorId="30DC50FC" wp14:editId="1FEC4C12">
+            <wp:extent cx="5731510" cy="4724400"/>
+            <wp:effectExtent l="0" t="0" r="2540" b="0"/>
+            <wp:docPr id="140601964" name="Picture 1"/>
             <wp:cNvGraphicFramePr>
               <a:graphicFrameLocks xmlns:a="http://schemas.openxmlformats.org/drawingml/2006/main" noChangeAspect="1"/>
             </wp:cNvGraphicFramePr>
@@ -10485,7 +10394,7 @@
               <a:graphicData uri="http://schemas.openxmlformats.org/drawingml/2006/picture">
                 <pic:pic xmlns:pic="http://schemas.openxmlformats.org/drawingml/2006/picture">
                   <pic:nvPicPr>
-                    <pic:cNvPr id="1195232573" name=""/>
+                    <pic:cNvPr id="140601964" name=""/>
                     <pic:cNvPicPr/>
                   </pic:nvPicPr>
                   <pic:blipFill>
@@ -10497,7 +10406,7 @@
                   <pic:spPr>
                     <a:xfrm>
                       <a:off x="0" y="0"/>
-                      <a:ext cx="5731510" cy="4742815"/>
+                      <a:ext cx="5731510" cy="4724400"/>
                     </a:xfrm>
                     <a:prstGeom prst="rect">
                       <a:avLst/>
@@ -10697,12 +10606,13 @@
         <w:rPr>
           <w:b/>
           <w:bCs/>
+          <w:noProof/>
           <w:sz w:val="32"/>
           <w:szCs w:val="32"/>
         </w:rPr>
         <w:drawing>
-          <wp:inline distT="0" distB="0" distL="0" distR="0" wp14:anchorId="07B33731" wp14:editId="1072061C">
-            <wp:extent cx="6454140" cy="4516120"/>
+          <wp:inline distT="0" distB="0" distL="0" distR="0" wp14:anchorId="07B33731" wp14:editId="709E5602">
+            <wp:extent cx="6454140" cy="5966460"/>
             <wp:effectExtent l="0" t="0" r="3810" b="0"/>
             <wp:docPr id="256137688" name="Picture 1"/>
             <wp:cNvGraphicFramePr>
@@ -10724,7 +10634,7 @@
                   <pic:spPr>
                     <a:xfrm>
                       <a:off x="0" y="0"/>
-                      <a:ext cx="6454140" cy="4516120"/>
+                      <a:ext cx="6454140" cy="5966460"/>
                     </a:xfrm>
                     <a:prstGeom prst="rect">
                       <a:avLst/>
@@ -10857,72 +10767,6 @@
           <w:szCs w:val="32"/>
         </w:rPr>
       </w:pPr>
-    </w:p>
-    <w:p>
-      <w:pPr>
-        <w:jc w:val="center"/>
-        <w:rPr>
-          <w:b/>
-          <w:bCs/>
-          <w:sz w:val="32"/>
-          <w:szCs w:val="32"/>
-        </w:rPr>
-      </w:pPr>
-    </w:p>
-    <w:p>
-      <w:pPr>
-        <w:jc w:val="center"/>
-        <w:rPr>
-          <w:b/>
-          <w:bCs/>
-          <w:sz w:val="32"/>
-          <w:szCs w:val="32"/>
-        </w:rPr>
-      </w:pPr>
-    </w:p>
-    <w:p>
-      <w:pPr>
-        <w:jc w:val="center"/>
-        <w:rPr>
-          <w:b/>
-          <w:bCs/>
-          <w:sz w:val="32"/>
-          <w:szCs w:val="32"/>
-        </w:rPr>
-      </w:pPr>
-    </w:p>
-    <w:p>
-      <w:pPr>
-        <w:jc w:val="center"/>
-        <w:rPr>
-          <w:b/>
-          <w:bCs/>
-          <w:sz w:val="32"/>
-          <w:szCs w:val="32"/>
-        </w:rPr>
-      </w:pPr>
-    </w:p>
-    <w:p>
-      <w:pPr>
-        <w:jc w:val="center"/>
-        <w:rPr>
-          <w:b/>
-          <w:bCs/>
-          <w:sz w:val="32"/>
-          <w:szCs w:val="32"/>
-        </w:rPr>
-      </w:pPr>
-    </w:p>
-    <w:p>
-      <w:pPr>
-        <w:jc w:val="center"/>
-        <w:rPr>
-          <w:b/>
-          <w:bCs/>
-          <w:sz w:val="32"/>
-          <w:szCs w:val="32"/>
-        </w:rPr>
-      </w:pPr>
       <w:r>
         <w:rPr>
           <w:b/>
@@ -10993,10 +10837,10 @@
           <w:szCs w:val="32"/>
         </w:rPr>
         <w:drawing>
-          <wp:inline distT="0" distB="0" distL="0" distR="0" wp14:anchorId="4A6679D8" wp14:editId="585D3074">
-            <wp:extent cx="4525006" cy="7735380"/>
-            <wp:effectExtent l="0" t="0" r="9525" b="0"/>
-            <wp:docPr id="120133588" name="Picture 1"/>
+          <wp:inline distT="0" distB="0" distL="0" distR="0" wp14:anchorId="2BF4C4BD" wp14:editId="682C551C">
+            <wp:extent cx="5229955" cy="7773485"/>
+            <wp:effectExtent l="0" t="0" r="8890" b="0"/>
+            <wp:docPr id="1024401715" name="Picture 1"/>
             <wp:cNvGraphicFramePr>
               <a:graphicFrameLocks xmlns:a="http://schemas.openxmlformats.org/drawingml/2006/main" noChangeAspect="1"/>
             </wp:cNvGraphicFramePr>
@@ -11004,7 +10848,7 @@
               <a:graphicData uri="http://schemas.openxmlformats.org/drawingml/2006/picture">
                 <pic:pic xmlns:pic="http://schemas.openxmlformats.org/drawingml/2006/picture">
                   <pic:nvPicPr>
-                    <pic:cNvPr id="120133588" name=""/>
+                    <pic:cNvPr id="1024401715" name=""/>
                     <pic:cNvPicPr/>
                   </pic:nvPicPr>
                   <pic:blipFill>
@@ -11016,7 +10860,7 @@
                   <pic:spPr>
                     <a:xfrm>
                       <a:off x="0" y="0"/>
-                      <a:ext cx="4525006" cy="7735380"/>
+                      <a:ext cx="5229955" cy="7773485"/>
                     </a:xfrm>
                     <a:prstGeom prst="rect">
                       <a:avLst/>
@@ -11078,10 +10922,10 @@
           <w:szCs w:val="32"/>
         </w:rPr>
         <w:drawing>
-          <wp:inline distT="0" distB="0" distL="0" distR="0" wp14:anchorId="175F2D7A" wp14:editId="39606DF9">
-            <wp:extent cx="4429743" cy="7668695"/>
-            <wp:effectExtent l="0" t="0" r="9525" b="8890"/>
-            <wp:docPr id="330792174" name="Picture 1"/>
+          <wp:inline distT="0" distB="0" distL="0" distR="0" wp14:anchorId="3F9B14B5" wp14:editId="3B763846">
+            <wp:extent cx="4515480" cy="7478169"/>
+            <wp:effectExtent l="0" t="0" r="0" b="8890"/>
+            <wp:docPr id="69359464" name="Picture 1"/>
             <wp:cNvGraphicFramePr>
               <a:graphicFrameLocks xmlns:a="http://schemas.openxmlformats.org/drawingml/2006/main" noChangeAspect="1"/>
             </wp:cNvGraphicFramePr>
@@ -11089,7 +10933,7 @@
               <a:graphicData uri="http://schemas.openxmlformats.org/drawingml/2006/picture">
                 <pic:pic xmlns:pic="http://schemas.openxmlformats.org/drawingml/2006/picture">
                   <pic:nvPicPr>
-                    <pic:cNvPr id="330792174" name=""/>
+                    <pic:cNvPr id="69359464" name=""/>
                     <pic:cNvPicPr/>
                   </pic:nvPicPr>
                   <pic:blipFill>
@@ -11101,7 +10945,7 @@
                   <pic:spPr>
                     <a:xfrm>
                       <a:off x="0" y="0"/>
-                      <a:ext cx="4429743" cy="7668695"/>
+                      <a:ext cx="4515480" cy="7478169"/>
                     </a:xfrm>
                     <a:prstGeom prst="rect">
                       <a:avLst/>
@@ -11126,6 +10970,17 @@
     </w:p>
     <w:p>
       <w:pPr>
+        <w:rPr>
+          <w:b/>
+          <w:bCs/>
+          <w:sz w:val="32"/>
+          <w:szCs w:val="32"/>
+        </w:rPr>
+      </w:pPr>
+    </w:p>
+    <w:p>
+      <w:pPr>
+        <w:jc w:val="center"/>
         <w:rPr>
           <w:b/>
           <w:bCs/>
@@ -11867,11 +11722,9 @@
             <w:tcW w:w="2036" w:type="dxa"/>
           </w:tcPr>
           <w:p>
-            <w:proofErr w:type="spellStart"/>
             <w:r>
               <w:t>user_id</w:t>
             </w:r>
-            <w:proofErr w:type="spellEnd"/>
           </w:p>
         </w:tc>
         <w:tc>
@@ -12375,11 +12228,9 @@
             <w:tcW w:w="2036" w:type="dxa"/>
           </w:tcPr>
           <w:p>
-            <w:proofErr w:type="spellStart"/>
             <w:r>
               <w:t>user_id</w:t>
             </w:r>
-            <w:proofErr w:type="spellEnd"/>
           </w:p>
         </w:tc>
         <w:tc>
@@ -12624,11 +12475,9 @@
             <w:tcW w:w="2036" w:type="dxa"/>
           </w:tcPr>
           <w:p>
-            <w:proofErr w:type="spellStart"/>
             <w:r>
               <w:t>user_id</w:t>
             </w:r>
-            <w:proofErr w:type="spellEnd"/>
           </w:p>
         </w:tc>
         <w:tc>
@@ -13329,6 +13178,353 @@
           <w:sz w:val="32"/>
           <w:szCs w:val="32"/>
         </w:rPr>
+        <w:t>Story</w:t>
+      </w:r>
+      <w:r>
+        <w:rPr>
+          <w:b/>
+          <w:bCs/>
+          <w:sz w:val="32"/>
+          <w:szCs w:val="32"/>
+        </w:rPr>
+        <w:t xml:space="preserve"> table:</w:t>
+      </w:r>
+    </w:p>
+    <w:tbl>
+      <w:tblPr>
+        <w:tblStyle w:val="TableGrid"/>
+        <w:tblW w:w="9351" w:type="dxa"/>
+        <w:tblLook w:val="04A0" w:firstRow="1" w:lastRow="0" w:firstColumn="1" w:lastColumn="0" w:noHBand="0" w:noVBand="1"/>
+      </w:tblPr>
+      <w:tblGrid>
+        <w:gridCol w:w="1296"/>
+        <w:gridCol w:w="1818"/>
+        <w:gridCol w:w="6237"/>
+      </w:tblGrid>
+      <w:tr>
+        <w:tc>
+          <w:tcPr>
+            <w:tcW w:w="1296" w:type="dxa"/>
+          </w:tcPr>
+          <w:p>
+            <w:pPr>
+              <w:rPr>
+                <w:b/>
+                <w:bCs/>
+                <w:sz w:val="28"/>
+                <w:szCs w:val="28"/>
+              </w:rPr>
+            </w:pPr>
+            <w:r>
+              <w:rPr>
+                <w:b/>
+                <w:bCs/>
+                <w:sz w:val="28"/>
+                <w:szCs w:val="28"/>
+              </w:rPr>
+              <w:t>Field</w:t>
+            </w:r>
+          </w:p>
+        </w:tc>
+        <w:tc>
+          <w:tcPr>
+            <w:tcW w:w="1818" w:type="dxa"/>
+          </w:tcPr>
+          <w:p>
+            <w:pPr>
+              <w:rPr>
+                <w:b/>
+                <w:bCs/>
+                <w:sz w:val="28"/>
+                <w:szCs w:val="28"/>
+              </w:rPr>
+            </w:pPr>
+            <w:r>
+              <w:rPr>
+                <w:b/>
+                <w:bCs/>
+                <w:sz w:val="28"/>
+                <w:szCs w:val="28"/>
+              </w:rPr>
+              <w:t>Type</w:t>
+            </w:r>
+          </w:p>
+        </w:tc>
+        <w:tc>
+          <w:tcPr>
+            <w:tcW w:w="6237" w:type="dxa"/>
+          </w:tcPr>
+          <w:p>
+            <w:pPr>
+              <w:rPr>
+                <w:b/>
+                <w:bCs/>
+                <w:sz w:val="28"/>
+                <w:szCs w:val="28"/>
+              </w:rPr>
+            </w:pPr>
+            <w:r>
+              <w:rPr>
+                <w:b/>
+                <w:bCs/>
+                <w:sz w:val="28"/>
+                <w:szCs w:val="28"/>
+              </w:rPr>
+              <w:t>Description</w:t>
+            </w:r>
+          </w:p>
+        </w:tc>
+      </w:tr>
+      <w:tr>
+        <w:tc>
+          <w:tcPr>
+            <w:tcW w:w="1296" w:type="dxa"/>
+          </w:tcPr>
+          <w:p>
+            <w:r>
+              <w:t>id</w:t>
+            </w:r>
+          </w:p>
+        </w:tc>
+        <w:tc>
+          <w:tcPr>
+            <w:tcW w:w="1818" w:type="dxa"/>
+          </w:tcPr>
+          <w:p>
+            <w:r>
+              <w:t>Long</w:t>
+            </w:r>
+          </w:p>
+        </w:tc>
+        <w:tc>
+          <w:tcPr>
+            <w:tcW w:w="6237" w:type="dxa"/>
+          </w:tcPr>
+          <w:p>
+            <w:r>
+              <w:t xml:space="preserve">Primary key that uniquely identifies each </w:t>
+            </w:r>
+            <w:r>
+              <w:t>story</w:t>
+            </w:r>
+          </w:p>
+        </w:tc>
+      </w:tr>
+      <w:tr>
+        <w:tc>
+          <w:tcPr>
+            <w:tcW w:w="1296" w:type="dxa"/>
+          </w:tcPr>
+          <w:p>
+            <w:proofErr w:type="spellStart"/>
+            <w:r>
+              <w:t>media</w:t>
+            </w:r>
+            <w:r>
+              <w:t>Url</w:t>
+            </w:r>
+            <w:proofErr w:type="spellEnd"/>
+          </w:p>
+        </w:tc>
+        <w:tc>
+          <w:tcPr>
+            <w:tcW w:w="1818" w:type="dxa"/>
+          </w:tcPr>
+          <w:p>
+            <w:r>
+              <w:t>String</w:t>
+            </w:r>
+          </w:p>
+        </w:tc>
+        <w:tc>
+          <w:tcPr>
+            <w:tcW w:w="6237" w:type="dxa"/>
+          </w:tcPr>
+          <w:p>
+            <w:r>
+              <w:t>URL/path of the uploaded story image</w:t>
+            </w:r>
+            <w:r>
+              <w:t>/video</w:t>
+            </w:r>
+          </w:p>
+        </w:tc>
+      </w:tr>
+      <w:tr>
+        <w:tc>
+          <w:tcPr>
+            <w:tcW w:w="1296" w:type="dxa"/>
+          </w:tcPr>
+          <w:p>
+            <w:r>
+              <w:t>createdAt</w:t>
+            </w:r>
+          </w:p>
+        </w:tc>
+        <w:tc>
+          <w:tcPr>
+            <w:tcW w:w="1818" w:type="dxa"/>
+          </w:tcPr>
+          <w:p>
+            <w:proofErr w:type="spellStart"/>
+            <w:r>
+              <w:t>LocalDateTime</w:t>
+            </w:r>
+            <w:proofErr w:type="spellEnd"/>
+          </w:p>
+        </w:tc>
+        <w:tc>
+          <w:tcPr>
+            <w:tcW w:w="6237" w:type="dxa"/>
+          </w:tcPr>
+          <w:p>
+            <w:r>
+              <w:t>Timestamp when the story is created</w:t>
+            </w:r>
+          </w:p>
+        </w:tc>
+      </w:tr>
+      <w:tr>
+        <w:tc>
+          <w:tcPr>
+            <w:tcW w:w="1296" w:type="dxa"/>
+          </w:tcPr>
+          <w:p>
+            <w:proofErr w:type="spellStart"/>
+            <w:r>
+              <w:t>expiresAt</w:t>
+            </w:r>
+            <w:proofErr w:type="spellEnd"/>
+          </w:p>
+        </w:tc>
+        <w:tc>
+          <w:tcPr>
+            <w:tcW w:w="1818" w:type="dxa"/>
+          </w:tcPr>
+          <w:p>
+            <w:proofErr w:type="spellStart"/>
+            <w:r>
+              <w:t>LocalDateTime</w:t>
+            </w:r>
+            <w:proofErr w:type="spellEnd"/>
+          </w:p>
+        </w:tc>
+        <w:tc>
+          <w:tcPr>
+            <w:tcW w:w="6237" w:type="dxa"/>
+          </w:tcPr>
+          <w:p>
+            <w:r>
+              <w:t>Timestamp when the story will expire (e.g., after 24 hours)</w:t>
+            </w:r>
+          </w:p>
+        </w:tc>
+      </w:tr>
+      <w:tr>
+        <w:tc>
+          <w:tcPr>
+            <w:tcW w:w="1296" w:type="dxa"/>
+          </w:tcPr>
+          <w:p>
+            <w:r>
+              <w:t>user</w:t>
+            </w:r>
+          </w:p>
+        </w:tc>
+        <w:tc>
+          <w:tcPr>
+            <w:tcW w:w="1818" w:type="dxa"/>
+          </w:tcPr>
+          <w:p>
+            <w:r>
+              <w:t>FK (User)</w:t>
+            </w:r>
+          </w:p>
+        </w:tc>
+        <w:tc>
+          <w:tcPr>
+            <w:tcW w:w="6237" w:type="dxa"/>
+          </w:tcPr>
+          <w:p>
+            <w:r>
+              <w:t>Reference to the user who created the story (Many-to-One relationship)</w:t>
+            </w:r>
+          </w:p>
+        </w:tc>
+      </w:tr>
+    </w:tbl>
+    <w:p>
+      <w:pPr>
+        <w:rPr>
+          <w:b/>
+          <w:bCs/>
+          <w:sz w:val="32"/>
+          <w:szCs w:val="32"/>
+        </w:rPr>
+      </w:pPr>
+    </w:p>
+    <w:p>
+      <w:pPr>
+        <w:rPr>
+          <w:b/>
+          <w:bCs/>
+          <w:sz w:val="32"/>
+          <w:szCs w:val="32"/>
+        </w:rPr>
+      </w:pPr>
+    </w:p>
+    <w:p>
+      <w:pPr>
+        <w:rPr>
+          <w:b/>
+          <w:bCs/>
+          <w:sz w:val="32"/>
+          <w:szCs w:val="32"/>
+        </w:rPr>
+      </w:pPr>
+    </w:p>
+    <w:p>
+      <w:pPr>
+        <w:rPr>
+          <w:b/>
+          <w:bCs/>
+          <w:sz w:val="32"/>
+          <w:szCs w:val="32"/>
+        </w:rPr>
+      </w:pPr>
+    </w:p>
+    <w:p>
+      <w:pPr>
+        <w:rPr>
+          <w:b/>
+          <w:bCs/>
+          <w:sz w:val="32"/>
+          <w:szCs w:val="32"/>
+        </w:rPr>
+      </w:pPr>
+    </w:p>
+    <w:p>
+      <w:pPr>
+        <w:pStyle w:val="ListParagraph"/>
+        <w:numPr>
+          <w:ilvl w:val="0"/>
+          <w:numId w:val="19"/>
+        </w:numPr>
+        <w:rPr>
+          <w:b/>
+          <w:bCs/>
+          <w:sz w:val="32"/>
+          <w:szCs w:val="32"/>
+        </w:rPr>
+      </w:pPr>
+      <w:r>
+        <w:rPr>
+          <w:b/>
+          <w:bCs/>
+          <w:sz w:val="32"/>
+          <w:szCs w:val="32"/>
+        </w:rPr>
+        <w:lastRenderedPageBreak/>
         <w:t>Chatroom table:</w:t>
       </w:r>
     </w:p>
@@ -13496,66 +13692,6 @@
     </w:p>
     <w:p>
       <w:pPr>
-        <w:rPr>
-          <w:b/>
-          <w:bCs/>
-          <w:sz w:val="32"/>
-          <w:szCs w:val="32"/>
-        </w:rPr>
-      </w:pPr>
-    </w:p>
-    <w:p>
-      <w:pPr>
-        <w:rPr>
-          <w:b/>
-          <w:bCs/>
-          <w:sz w:val="32"/>
-          <w:szCs w:val="32"/>
-        </w:rPr>
-      </w:pPr>
-    </w:p>
-    <w:p>
-      <w:pPr>
-        <w:rPr>
-          <w:b/>
-          <w:bCs/>
-          <w:sz w:val="32"/>
-          <w:szCs w:val="32"/>
-        </w:rPr>
-      </w:pPr>
-    </w:p>
-    <w:p>
-      <w:pPr>
-        <w:rPr>
-          <w:b/>
-          <w:bCs/>
-          <w:sz w:val="32"/>
-          <w:szCs w:val="32"/>
-        </w:rPr>
-      </w:pPr>
-    </w:p>
-    <w:p>
-      <w:pPr>
-        <w:rPr>
-          <w:b/>
-          <w:bCs/>
-          <w:sz w:val="32"/>
-          <w:szCs w:val="32"/>
-        </w:rPr>
-      </w:pPr>
-    </w:p>
-    <w:p>
-      <w:pPr>
-        <w:rPr>
-          <w:b/>
-          <w:bCs/>
-          <w:sz w:val="32"/>
-          <w:szCs w:val="32"/>
-        </w:rPr>
-      </w:pPr>
-    </w:p>
-    <w:p>
-      <w:pPr>
         <w:pStyle w:val="ListParagraph"/>
         <w:numPr>
           <w:ilvl w:val="0"/>
@@ -13575,7 +13711,6 @@
           <w:sz w:val="32"/>
           <w:szCs w:val="32"/>
         </w:rPr>
-        <w:lastRenderedPageBreak/>
         <w:t>Message table:</w:t>
       </w:r>
     </w:p>
@@ -14043,116 +14178,62 @@
     </w:p>
     <w:p>
       <w:pPr>
-        <w:rPr>
-          <w:b/>
-          <w:bCs/>
-          <w:sz w:val="32"/>
-          <w:szCs w:val="32"/>
-        </w:rPr>
-      </w:pPr>
-    </w:p>
-    <w:p>
-      <w:pPr>
-        <w:rPr>
-          <w:b/>
-          <w:bCs/>
-          <w:sz w:val="32"/>
-          <w:szCs w:val="32"/>
-        </w:rPr>
-      </w:pPr>
-    </w:p>
-    <w:p>
-      <w:pPr>
-        <w:rPr>
-          <w:b/>
-          <w:bCs/>
-          <w:sz w:val="32"/>
-          <w:szCs w:val="32"/>
-        </w:rPr>
-      </w:pPr>
-    </w:p>
-    <w:p>
-      <w:pPr>
-        <w:rPr>
-          <w:b/>
-          <w:bCs/>
-          <w:sz w:val="32"/>
-          <w:szCs w:val="32"/>
-        </w:rPr>
-      </w:pPr>
-    </w:p>
-    <w:p>
-      <w:pPr>
-        <w:rPr>
-          <w:b/>
-          <w:bCs/>
-          <w:sz w:val="32"/>
-          <w:szCs w:val="32"/>
-        </w:rPr>
-      </w:pPr>
-    </w:p>
-    <w:p>
-      <w:pPr>
-        <w:rPr>
-          <w:b/>
-          <w:bCs/>
-          <w:sz w:val="32"/>
-          <w:szCs w:val="32"/>
-        </w:rPr>
-      </w:pPr>
-    </w:p>
-    <w:p>
-      <w:pPr>
-        <w:rPr>
-          <w:b/>
-          <w:bCs/>
-          <w:sz w:val="32"/>
-          <w:szCs w:val="32"/>
-        </w:rPr>
-      </w:pPr>
-    </w:p>
-    <w:p>
-      <w:pPr>
-        <w:rPr>
-          <w:b/>
-          <w:bCs/>
-          <w:sz w:val="32"/>
-          <w:szCs w:val="32"/>
-        </w:rPr>
-      </w:pPr>
-    </w:p>
-    <w:p>
-      <w:pPr>
-        <w:rPr>
-          <w:b/>
-          <w:bCs/>
-          <w:sz w:val="32"/>
-          <w:szCs w:val="32"/>
-        </w:rPr>
-      </w:pPr>
-    </w:p>
-    <w:p>
-      <w:pPr>
-        <w:rPr>
-          <w:b/>
-          <w:bCs/>
-          <w:sz w:val="32"/>
-          <w:szCs w:val="32"/>
-        </w:rPr>
-      </w:pPr>
-    </w:p>
-    <w:p>
-      <w:pPr>
-        <w:rPr>
-          <w:b/>
-          <w:bCs/>
-          <w:sz w:val="32"/>
-          <w:szCs w:val="32"/>
-        </w:rPr>
-      </w:pPr>
-    </w:p>
-    <w:p>
-      <w:pPr>
+        <w:jc w:val="center"/>
+        <w:rPr>
+          <w:b/>
+          <w:bCs/>
+          <w:sz w:val="32"/>
+          <w:szCs w:val="32"/>
+        </w:rPr>
+      </w:pPr>
+    </w:p>
+    <w:p>
+      <w:pPr>
+        <w:jc w:val="center"/>
+        <w:rPr>
+          <w:b/>
+          <w:bCs/>
+          <w:sz w:val="32"/>
+          <w:szCs w:val="32"/>
+        </w:rPr>
+      </w:pPr>
+    </w:p>
+    <w:p>
+      <w:pPr>
+        <w:jc w:val="center"/>
+        <w:rPr>
+          <w:b/>
+          <w:bCs/>
+          <w:sz w:val="32"/>
+          <w:szCs w:val="32"/>
+        </w:rPr>
+      </w:pPr>
+    </w:p>
+    <w:p>
+      <w:pPr>
+        <w:jc w:val="center"/>
+        <w:rPr>
+          <w:b/>
+          <w:bCs/>
+          <w:sz w:val="32"/>
+          <w:szCs w:val="32"/>
+        </w:rPr>
+      </w:pPr>
+    </w:p>
+    <w:p>
+      <w:pPr>
+        <w:jc w:val="center"/>
+        <w:rPr>
+          <w:b/>
+          <w:bCs/>
+          <w:sz w:val="32"/>
+          <w:szCs w:val="32"/>
+        </w:rPr>
+      </w:pPr>
+    </w:p>
+    <w:p>
+      <w:pPr>
+        <w:jc w:val="center"/>
         <w:rPr>
           <w:b/>
           <w:bCs/>
@@ -15978,21 +16059,7 @@
           <w:sz w:val="28"/>
           <w:szCs w:val="28"/>
         </w:rPr>
-        <w:t xml:space="preserve">Although the system is fully functional, it can be further enhanced with advanced features and architectural improvements. An AI-based recommendation engine can be implemented to provide personalized content feeds based on user </w:t>
-      </w:r>
-      <w:r>
-        <w:rPr>
-          <w:sz w:val="28"/>
-          <w:szCs w:val="28"/>
-        </w:rPr>
-        <w:t>behaviour</w:t>
-      </w:r>
-      <w:r>
-        <w:rPr>
-          <w:sz w:val="28"/>
-          <w:szCs w:val="28"/>
-        </w:rPr>
-        <w:t xml:space="preserve"> and interests. Machine learning models can also be integrated for automated content moderation to detect spam, inappropriate content, or fake accounts.</w:t>
+        <w:t>Although the system is fully functional, it can be further enhanced with advanced features and architectural improvements. An AI-based recommendation engine can be implemented to provide personalized content feeds based on user behaviour and interests. Machine learning models can also be integrated for automated content moderation to detect spam, inappropriate content, or fake accounts.</w:t>
       </w:r>
     </w:p>
     <w:p>
@@ -22616,7 +22683,9 @@
     <w:rsid w:val="00221B07"/>
     <w:rsid w:val="006850CA"/>
     <w:rsid w:val="00817552"/>
+    <w:rsid w:val="0088592D"/>
     <w:rsid w:val="00947376"/>
+    <w:rsid w:val="00B34B7E"/>
     <w:rsid w:val="00D3056B"/>
     <w:rsid w:val="00D87A0F"/>
   </w:rsids>

</xml_diff>